<commit_message>
Clarify trial free energies versus unresolved phase branches
Document existing half-row and full-period values; distinguish initialization labels, optimizer outcomes, stationary branches and global minima. Correct continuous-transition derivative and chi-sharpening criteria. Propose unbiased chi128 continuation without launching or authorizing new production. Preserve original numerical records, core physics, framework sources and 65 mathematical blocks.
</commit_message>
<xml_diff>
--- a/papers/v34/v34-revision-report.docx
+++ b/papers/v34/v34-revision-report.docx
@@ -137,7 +137,16 @@
           <w:b w:val="0"/>
           <w:i w:val="0"/>
         </w:rPr>
-        <w:t>The source updates the chosen method and completed finite fourth-Clifford/d=3 pilots without promoting them to thermodynamic results. Old v33 tables remain historical observations, not relabeled χ128 data.</w:t>
+        <w:t>The source explicitly distinguishes measured half-row/full-period trial-state functionals from unresolved phase branches. The energies were recorded; initialization labels are not phase identities, and agreement from two starts does not certify a global minimum. It corrects the claim that a continuous transition generically has a kink in f, and warns that χ-dependent sharpening is not a binary order test. Unbiased branch continuation is the selected next protocol, with a proposed bounded pilot still requiring its own runtime authorization.</w:t>
+      </w:r>
+    </w:p>
+    <w:p>
+      <w:r>
+        <w:rPr>
+          <w:b w:val="0"/>
+          <w:i w:val="0"/>
+        </w:rPr>
+        <w:t>The completed finite fourth-Clifford/d=3 pilots remain finite observations. Old v33 tables remain historical observations, not relabeled χ128 data.</w:t>
       </w:r>
     </w:p>
     <w:p>

</xml_diff>

<commit_message>
Record chi128 second-common-rate test: complete: both upper-rate numerical states accepted
</commit_message>
<xml_diff>
--- a/papers/v34/v34-revision-report.docx
+++ b/papers/v34/v34-revision-report.docx
@@ -147,6 +147,41 @@
           <w:i w:val="0"/>
         </w:rPr>
         <w:t>The completed finite fourth-Clifford/d=3 pilots remain finite observations. Old v33 tables remain historical observations, not relabeled χ128 data.</w:t>
+      </w:r>
+    </w:p>
+    <w:p>
+      <w:pPr>
+        <w:pStyle w:val="Heading2"/>
+      </w:pPr>
+      <w:r>
+        <w:rPr>
+          <w:b w:val="0"/>
+          <w:i w:val="0"/>
+        </w:rPr>
+        <w:t>One additional common-rate test</w:t>
+      </w:r>
+    </w:p>
+    <w:p>
+      <w:r>
+        <w:rPr>
+          <w:b w:val="0"/>
+          <w:i w:val="0"/>
+        </w:rPr>
+        <w:t xml:space="preserve">The separately authorized .30485 result is </w:t>
+      </w:r>
+      <w:r>
+        <w:rPr>
+          <w:b/>
+          <w:i w:val="0"/>
+        </w:rPr>
+        <w:t>complete: both upper-rate numerical states accepted</w:t>
+      </w:r>
+      <w:r>
+        <w:rPr>
+          <w:b w:val="0"/>
+          <w:i w:val="0"/>
+        </w:rPr>
+        <w:t>. The former large-order history ended with small order diagnostics in the completed test. Even though numerical ranking signs reverse, this does not produce a retained large-/small-order pressure-crossing bracket. It neither proves continuity nor locates a physical spinodal or a thermodynamic window width. No further rate, χ192 or stability production is included.</w:t>
       </w:r>
     </w:p>
     <w:p>

</xml_diff>

<commit_message>
Record chi128 closer common rate: complete: both closer-rate numerical states accepted
</commit_message>
<xml_diff>
--- a/papers/v34/v34-revision-report.docx
+++ b/papers/v34/v34-revision-report.docx
@@ -182,6 +182,86 @@
           <w:i w:val="0"/>
         </w:rPr>
         <w:t>. The former large-order history ended with small order diagnostics in the completed test. Even though numerical ranking signs reverse, this does not produce a retained large-/small-order pressure-crossing bracket. It neither proves continuity nor locates a physical spinodal or a thermodynamic window width. No further rate, χ192 or stability production is included.</w:t>
+      </w:r>
+    </w:p>
+    <w:p>
+      <w:pPr>
+        <w:pStyle w:val="Heading2"/>
+      </w:pPr>
+      <w:r>
+        <w:rPr>
+          <w:b w:val="0"/>
+          <w:i w:val="0"/>
+        </w:rPr>
+        <w:t>Separately authorized closer common rate</w:t>
+      </w:r>
+    </w:p>
+    <w:p>
+      <w:r>
+        <w:rPr>
+          <w:b w:val="0"/>
+          <w:i w:val="0"/>
+        </w:rPr>
+        <w:t xml:space="preserve">The </w:t>
+      </w:r>
+      <w:r>
+        <w:rPr>
+          <w:rFonts w:ascii="Consolas" w:hAnsi="Consolas" w:eastAsia="Consolas" w:cs="Consolas"/>
+          <w:b w:val="0"/>
+          <w:i w:val="0"/>
+        </w:rPr>
+        <w:t>.304825</w:t>
+      </w:r>
+      <w:r>
+        <w:rPr>
+          <w:b w:val="0"/>
+          <w:i w:val="0"/>
+        </w:rPr>
+        <w:t xml:space="preserve">, χ128 warm-continuation status is </w:t>
+      </w:r>
+      <w:r>
+        <w:rPr>
+          <w:b/>
+          <w:i w:val="0"/>
+        </w:rPr>
+        <w:t>complete: both closer-rate numerical states accepted</w:t>
+      </w:r>
+      <w:r>
+        <w:rPr>
+          <w:b w:val="0"/>
+          <w:i w:val="0"/>
+        </w:rPr>
+        <w:t xml:space="preserve">. In the completed test, large/small numerical order contrast is retained and the large-order history has lower half-row and separate period-trial estimates among the computed pair. No ranking reversal occurs against </w:t>
+      </w:r>
+      <w:r>
+        <w:rPr>
+          <w:rFonts w:ascii="Consolas" w:hAnsi="Consolas" w:eastAsia="Consolas" w:cs="Consolas"/>
+          <w:b w:val="0"/>
+          <w:i w:val="0"/>
+        </w:rPr>
+        <w:t>.30480</w:t>
+      </w:r>
+      <w:r>
+        <w:rPr>
+          <w:b w:val="0"/>
+          <w:i w:val="0"/>
+        </w:rPr>
+        <w:t xml:space="preserve">, so there is still no pressure bracket or thermodynamic verdict. The prior </w:t>
+      </w:r>
+      <w:r>
+        <w:rPr>
+          <w:rFonts w:ascii="Consolas" w:hAnsi="Consolas" w:eastAsia="Consolas" w:cs="Consolas"/>
+          <w:b w:val="0"/>
+          <w:i w:val="0"/>
+        </w:rPr>
+        <w:t>.30485</w:t>
+      </w:r>
+      <w:r>
+        <w:rPr>
+          <w:b w:val="0"/>
+          <w:i w:val="0"/>
+        </w:rPr>
+        <w:t xml:space="preserve"> character-loss outcome remains preserved; neither experiment identifies a physical spinodal or stability boundary.</w:t>
       </w:r>
     </w:p>
     <w:p>

</xml_diff>